<commit_message>
Rebrand: PRAMETRA — Financial Integrity & Audit Intelligence Platform
Product name PRAMETRA with tagline 'Evidence behind every number';
the mathematical core is PRAMETRA PRISM (Multi-Model Financial Integrity
Engine - one population, multiple lenses, explainable results). Module
naming scheme applied across the sidebar, locked-module cards, module
display names in gating messages, TOTP issuer, API root, client portal,
partner kit and the DOCX one-pager. API contracts, enum names and data
untouched - branding only.

Co-Authored-By: Claude Fable 5 <noreply@anthropic.com>
</commit_message>
<xml_diff>
--- a/phase0/design-partner-kit/Design-Partner-Brief.docx
+++ b/phase0/design-partner-kit/Design-Partner-Brief.docx
@@ -11,10 +11,10 @@
           <w:b/>
           <w:bCs/>
           <w:color w:val="0E1F38"/>
-          <w:sz w:val="34"/>
-          <w:szCs w:val="34"/>
-        </w:rPr>
-        <w:t xml:space="preserve">Ledger Integrity &amp; Audit Intelligence Platform</w:t>
+          <w:sz w:val="40"/>
+          <w:szCs w:val="40"/>
+        </w:rPr>
+        <w:t xml:space="preserve">PRAMETRA</w:t>
       </w:r>
     </w:p>
     <w:p>
@@ -30,7 +30,7 @@
           <w:sz w:val="21"/>
           <w:szCs w:val="21"/>
         </w:rPr>
-        <w:t xml:space="preserve">Design Partner Brief — full-population audit analytics for CA firms</w:t>
+        <w:t xml:space="preserve">Financial Integrity &amp; Audit Intelligence Platform — evidence behind every number · Design Partner Brief</w:t>
       </w:r>
     </w:p>
     <w:p>
@@ -42,7 +42,7 @@
           <w:sz w:val="20"/>
           <w:szCs w:val="20"/>
         </w:rPr>
-        <w:t xml:space="preserve">A platform that analyses complete transaction populations — every row, not a sample — flags what deserves review through 21 detection rules across six independent risk families, reconciles books against GSTR-1/2B/3B and bank statements, collects client evidence through a secure portal, and produces review-ready workpapers with a one-click Audit File Pack.</w:t>
+        <w:t xml:space="preserve">A platform that analyses complete transaction populations — every row, not a sample — flags what deserves review through the PRAMETRA PRISM engine — 21 detection rules across six independent risk families (one population, multiple lenses, explainable results), reconciles books against GSTR-1/2B/3B and bank statements, collects client evidence through a secure portal, and produces review-ready workpapers with a one-click Audit File Pack.</w:t>
       </w:r>
     </w:p>
     <w:p>

</xml_diff>